<commit_message>
ESP32 board is burned， so we switch to ESP32-S2 board
</commit_message>
<xml_diff>
--- a/Doc/datasheets/IV18模块脚定义.docx
+++ b/Doc/datasheets/IV18模块脚定义.docx
@@ -27,6 +27,7 @@
           <w:p>
             <w:pPr>
               <w:rPr>
+                <w:rFonts w:hint="eastAsia"/>
                 <w:sz w:val="16"/>
                 <w:szCs w:val="18"/>
               </w:rPr>
@@ -48,6 +49,7 @@
           <w:p>
             <w:pPr>
               <w:rPr>
+                <w:rFonts w:hint="eastAsia"/>
                 <w:sz w:val="16"/>
                 <w:szCs w:val="18"/>
               </w:rPr>
@@ -69,6 +71,7 @@
           <w:p>
             <w:pPr>
               <w:rPr>
+                <w:rFonts w:hint="eastAsia"/>
                 <w:sz w:val="16"/>
                 <w:szCs w:val="18"/>
               </w:rPr>
@@ -90,6 +93,7 @@
           <w:p>
             <w:pPr>
               <w:rPr>
+                <w:rFonts w:hint="eastAsia"/>
                 <w:sz w:val="16"/>
                 <w:szCs w:val="18"/>
               </w:rPr>
@@ -111,6 +115,7 @@
           <w:p>
             <w:pPr>
               <w:rPr>
+                <w:rFonts w:hint="eastAsia"/>
                 <w:sz w:val="16"/>
                 <w:szCs w:val="18"/>
               </w:rPr>
@@ -132,6 +137,7 @@
           <w:p>
             <w:pPr>
               <w:rPr>
+                <w:rFonts w:hint="eastAsia"/>
                 <w:sz w:val="16"/>
                 <w:szCs w:val="18"/>
               </w:rPr>
@@ -153,6 +159,7 @@
           <w:p>
             <w:pPr>
               <w:rPr>
+                <w:rFonts w:hint="eastAsia"/>
                 <w:sz w:val="16"/>
                 <w:szCs w:val="18"/>
               </w:rPr>
@@ -220,6 +227,7 @@
           <w:p>
             <w:pPr>
               <w:rPr>
+                <w:rFonts w:hint="eastAsia"/>
                 <w:sz w:val="16"/>
                 <w:szCs w:val="18"/>
               </w:rPr>
@@ -241,6 +249,7 @@
           <w:p>
             <w:pPr>
               <w:rPr>
+                <w:rFonts w:hint="eastAsia"/>
                 <w:sz w:val="16"/>
                 <w:szCs w:val="18"/>
               </w:rPr>
@@ -262,6 +271,7 @@
           <w:p>
             <w:pPr>
               <w:rPr>
+                <w:rFonts w:hint="eastAsia"/>
                 <w:sz w:val="16"/>
                 <w:szCs w:val="18"/>
               </w:rPr>
@@ -283,6 +293,7 @@
           <w:p>
             <w:pPr>
               <w:rPr>
+                <w:rFonts w:hint="eastAsia"/>
                 <w:sz w:val="16"/>
                 <w:szCs w:val="18"/>
               </w:rPr>
@@ -304,6 +315,7 @@
           <w:p>
             <w:pPr>
               <w:rPr>
+                <w:rFonts w:hint="eastAsia"/>
                 <w:sz w:val="16"/>
                 <w:szCs w:val="18"/>
               </w:rPr>
@@ -325,6 +337,7 @@
           <w:p>
             <w:pPr>
               <w:rPr>
+                <w:rFonts w:hint="eastAsia"/>
                 <w:sz w:val="16"/>
                 <w:szCs w:val="18"/>
               </w:rPr>
@@ -346,6 +359,7 @@
           <w:p>
             <w:pPr>
               <w:rPr>
+                <w:rFonts w:hint="eastAsia"/>
                 <w:sz w:val="16"/>
                 <w:szCs w:val="18"/>
               </w:rPr>
@@ -372,6 +386,7 @@
                 <w:szCs w:val="18"/>
               </w:rPr>
             </w:pPr>
+            <w:proofErr w:type="spellStart"/>
             <w:r>
               <w:rPr>
                 <w:rFonts w:hint="eastAsia"/>
@@ -380,6 +395,7 @@
               </w:rPr>
               <w:t>Vcc</w:t>
             </w:r>
+            <w:proofErr w:type="spellEnd"/>
           </w:p>
         </w:tc>
         <w:tc>
@@ -394,6 +410,7 @@
                 <w:szCs w:val="18"/>
               </w:rPr>
             </w:pPr>
+            <w:proofErr w:type="spellStart"/>
             <w:r>
               <w:rPr>
                 <w:rFonts w:hint="eastAsia"/>
@@ -402,6 +419,7 @@
               </w:rPr>
               <w:t>Vh</w:t>
             </w:r>
+            <w:proofErr w:type="spellEnd"/>
           </w:p>
         </w:tc>
       </w:tr>
@@ -614,7 +632,13 @@
         </w:tc>
       </w:tr>
     </w:tbl>
-    <w:p/>
+    <w:p>
+      <w:pPr>
+        <w:rPr>
+          <w:rFonts w:hint="eastAsia"/>
+        </w:rPr>
+      </w:pPr>
+    </w:p>
     <w:sectPr>
       <w:pgSz w:w="11906" w:h="16838"/>
       <w:pgMar w:top="1440" w:right="1800" w:bottom="1440" w:left="1800" w:header="851" w:footer="992" w:gutter="0"/>

</xml_diff>